<commit_message>
Final report: state the blind topic check result (35.5% agreement) and its limits
</commit_message>
<xml_diff>
--- a/docs/final_report.docx
+++ b/docs/final_report.docx
@@ -3153,7 +3153,7 @@
         <w:t>boring</w:t>
       </w:r>
       <w:r>
-        <w:t xml:space="preserve"> appear in 9.1% of negative reviews against 0.8% of positive ones (11x). A manual check of 200 labelled reviews is being redone with blind labels (card #33), so we do not report an agreement figure here.</w:t>
+        <w:t xml:space="preserve"> appear in 9.1% of negative reviews against 0.8% of positive ones (11x). A blind check of 200 reviews (labelled by an AI assistant with the model's topic hidden, in one pass) agrees with the model on 35.5% of them (Cohen's kappa 0.30), and 73 reviews had no clear theme. Three topics are recovered well: Early Access and content scarcity (88%), repetition and pacing (64%) and multiplayer, crashes and bugs (60%). The generic "flawed design" topic (0%) and the boss, replayability and balance topics (8% to 16%) are weak, so the themes built on them are exploratory. An earlier 96% figure came from labels that were not independent of the model and was withdrawn; a human re-label of a subset would strengthen the check.</w:t>
       </w:r>
     </w:p>
     <w:p>
@@ -3483,6 +3483,14 @@
       </w:pPr>
       <w:r>
         <w:t>The review models use reviewer-history columns read at scrape time, so they explain reviews rather than score a launch.</w:t>
+      </w:r>
+    </w:p>
+    <w:p>
+      <w:pPr>
+        <w:pStyle w:val="ListBullet"/>
+      </w:pPr>
+      <w:r>
+        <w:t>The blind topic check agrees with the model on only 35.5% of reviews (one AI annotator); only the Early Access, repetition and multiplayer-and-crash themes are reliable.</w:t>
       </w:r>
     </w:p>
     <w:p>

</xml_diff>

<commit_message>
Game-level and review Logistic Regression grid searches, tuning integration
Adds the game-level grid searches (Logistic Regression, Random Forest, LightGBM,
XGBoost) and the review-level Logistic Regression search to grid_search.py,
reruns the comparison with a default-against-tuned table, and updates the
notes, protocol, report, slides, notebook addendum and README.

Co-authored-by: srihithathotakura <srihithathotakura@gmail.com>
</commit_message>
<xml_diff>
--- a/docs/final_report.docx
+++ b/docs/final_report.docx
@@ -1712,7 +1712,7 @@
                 <w:b w:val="0"/>
                 <w:sz w:val="18"/>
               </w:rPr>
-              <w:t>0.421 +/- 0.038</w:t>
+              <w:t>0.434 +/- 0.037</w:t>
             </w:r>
           </w:p>
         </w:tc>
@@ -1726,7 +1726,7 @@
                 <w:b w:val="0"/>
                 <w:sz w:val="18"/>
               </w:rPr>
-              <w:t>0.404</w:t>
+              <w:t>0.371</w:t>
             </w:r>
           </w:p>
         </w:tc>
@@ -1740,7 +1740,7 @@
                 <w:b w:val="0"/>
                 <w:sz w:val="18"/>
               </w:rPr>
-              <w:t>0.14</w:t>
+              <w:t>0.10</w:t>
             </w:r>
           </w:p>
         </w:tc>
@@ -1754,7 +1754,7 @@
                 <w:b w:val="0"/>
                 <w:sz w:val="18"/>
               </w:rPr>
-              <w:t>[0.34, 0.46]</w:t>
+              <w:t>[0.31, 0.43]</w:t>
             </w:r>
           </w:p>
         </w:tc>
@@ -1784,7 +1784,7 @@
                 <w:b w:val="0"/>
                 <w:sz w:val="18"/>
               </w:rPr>
-              <w:t>0.447 +/- 0.019</w:t>
+              <w:t>0.445 +/- 0.027</w:t>
             </w:r>
           </w:p>
         </w:tc>
@@ -1798,7 +1798,7 @@
                 <w:b w:val="0"/>
                 <w:sz w:val="18"/>
               </w:rPr>
-              <w:t>0.421</w:t>
+              <w:t>0.372</w:t>
             </w:r>
           </w:p>
         </w:tc>
@@ -1812,7 +1812,7 @@
                 <w:b w:val="0"/>
                 <w:sz w:val="18"/>
               </w:rPr>
-              <w:t>0.45</w:t>
+              <w:t>0.22</w:t>
             </w:r>
           </w:p>
         </w:tc>
@@ -1826,7 +1826,7 @@
                 <w:b w:val="0"/>
                 <w:sz w:val="18"/>
               </w:rPr>
-              <w:t>[0.36, 0.48]</w:t>
+              <w:t>[0.31, 0.43]</w:t>
             </w:r>
           </w:p>
         </w:tc>
@@ -1856,7 +1856,7 @@
                 <w:b w:val="0"/>
                 <w:sz w:val="18"/>
               </w:rPr>
-              <w:t>0.418 +/- 0.044</w:t>
+              <w:t>0.444 +/- 0.027</w:t>
             </w:r>
           </w:p>
         </w:tc>
@@ -1870,7 +1870,7 @@
                 <w:b w:val="0"/>
                 <w:sz w:val="18"/>
               </w:rPr>
-              <w:t>0.388</w:t>
+              <w:t>0.437</w:t>
             </w:r>
           </w:p>
         </w:tc>
@@ -1884,7 +1884,7 @@
                 <w:b w:val="0"/>
                 <w:sz w:val="18"/>
               </w:rPr>
-              <w:t>0.14</w:t>
+              <w:t>0.41</w:t>
             </w:r>
           </w:p>
         </w:tc>
@@ -1898,7 +1898,7 @@
                 <w:b w:val="0"/>
                 <w:sz w:val="18"/>
               </w:rPr>
-              <w:t>[0.33, 0.45]</w:t>
+              <w:t>[0.38, 0.50]</w:t>
             </w:r>
           </w:p>
         </w:tc>
@@ -2239,7 +2239,7 @@
         <w:t>Game level.</w:t>
       </w:r>
       <w:r>
-        <w:t xml:space="preserve"> All four real models beat the baseline by a similar margin and the simple ones do as well as boosting; the intervals overlap (299 test games, 51 of them Struggling), so there is no winner. Struggling games are the hard class. More data would not help (a flat learning curve); more information would.</w:t>
+        <w:t xml:space="preserve"> All four real models beat the baseline (0.22). After grid search XGBoost (0.437) and Logistic Regression (0.423) hold up on the test games, while Random Forest (0.371) and LightGBM (0.372) fall back although their cross-validation scores rose; the intervals overlap (299 test games, 51 of them Struggling), so there is no winner. Struggling games are the hard class. More data would not help (a flat learning curve); more information would.</w:t>
       </w:r>
     </w:p>
     <w:p>
@@ -2631,7 +2631,7 @@
                 <w:b w:val="0"/>
                 <w:sz w:val="18"/>
               </w:rPr>
-              <w:t>not yet run</w:t>
+              <w:t>11</w:t>
             </w:r>
           </w:p>
         </w:tc>
@@ -2639,19 +2639,44 @@
           <w:tcPr>
             <w:tcW w:type="dxa" w:w="1728"/>
           </w:tcPr>
-          <w:p/>
+          <w:p>
+            <w:r>
+              <w:rPr>
+                <w:b w:val="0"/>
+                <w:sz w:val="18"/>
+              </w:rPr>
+              <w:t>0.2084</w:t>
+            </w:r>
+          </w:p>
         </w:tc>
         <w:tc>
           <w:tcPr>
             <w:tcW w:type="dxa" w:w="1728"/>
           </w:tcPr>
-          <w:p/>
+          <w:p>
+            <w:r>
+              <w:rPr>
+                <w:b w:val="0"/>
+                <w:sz w:val="18"/>
+              </w:rPr>
+              <w:t>0.2084</w:t>
+            </w:r>
+          </w:p>
         </w:tc>
         <w:tc>
           <w:tcPr>
             <w:tcW w:type="dxa" w:w="1728"/>
           </w:tcPr>
-          <w:p/>
+          <w:p>
+            <w:r>
+              <w:rPr>
+                <w:rFonts w:ascii="Consolas" w:hAnsi="Consolas"/>
+                <w:b w:val="0"/>
+                <w:sz w:val="18"/>
+              </w:rPr>
+              <w:t>{"C": 10.0, "class_weight": "balanced"}</w:t>
+            </w:r>
+          </w:p>
         </w:tc>
       </w:tr>
       <w:tr>
@@ -2898,7 +2923,7 @@
                 <w:b w:val="0"/>
                 <w:sz w:val="18"/>
               </w:rPr>
-              <w:t>not yet run</w:t>
+              <w:t>12</w:t>
             </w:r>
           </w:p>
         </w:tc>
@@ -2906,19 +2931,44 @@
           <w:tcPr>
             <w:tcW w:type="dxa" w:w="1728"/>
           </w:tcPr>
-          <w:p/>
+          <w:p>
+            <w:r>
+              <w:rPr>
+                <w:b w:val="0"/>
+                <w:sz w:val="18"/>
+              </w:rPr>
+              <w:t>0.4177</w:t>
+            </w:r>
+          </w:p>
         </w:tc>
         <w:tc>
           <w:tcPr>
             <w:tcW w:type="dxa" w:w="1728"/>
           </w:tcPr>
-          <w:p/>
+          <w:p>
+            <w:r>
+              <w:rPr>
+                <w:b w:val="0"/>
+                <w:sz w:val="18"/>
+              </w:rPr>
+              <w:t>0.4224</w:t>
+            </w:r>
+          </w:p>
         </w:tc>
         <w:tc>
           <w:tcPr>
             <w:tcW w:type="dxa" w:w="1728"/>
           </w:tcPr>
-          <w:p/>
+          <w:p>
+            <w:r>
+              <w:rPr>
+                <w:rFonts w:ascii="Consolas" w:hAnsi="Consolas"/>
+                <w:b w:val="0"/>
+                <w:sz w:val="18"/>
+              </w:rPr>
+              <w:t>{"C": 0.01, "penalty": "l2"}</w:t>
+            </w:r>
+          </w:p>
         </w:tc>
       </w:tr>
       <w:tr>
@@ -2946,7 +2996,7 @@
                 <w:b w:val="0"/>
                 <w:sz w:val="18"/>
               </w:rPr>
-              <w:t>not yet run</w:t>
+              <w:t>60</w:t>
             </w:r>
           </w:p>
         </w:tc>
@@ -2954,19 +3004,44 @@
           <w:tcPr>
             <w:tcW w:type="dxa" w:w="1728"/>
           </w:tcPr>
-          <w:p/>
+          <w:p>
+            <w:r>
+              <w:rPr>
+                <w:b w:val="0"/>
+                <w:sz w:val="18"/>
+              </w:rPr>
+              <w:t>0.3535</w:t>
+            </w:r>
+          </w:p>
         </w:tc>
         <w:tc>
           <w:tcPr>
             <w:tcW w:type="dxa" w:w="1728"/>
           </w:tcPr>
-          <w:p/>
+          <w:p>
+            <w:r>
+              <w:rPr>
+                <w:b w:val="0"/>
+                <w:sz w:val="18"/>
+              </w:rPr>
+              <w:t>0.4340</w:t>
+            </w:r>
+          </w:p>
         </w:tc>
         <w:tc>
           <w:tcPr>
             <w:tcW w:type="dxa" w:w="1728"/>
           </w:tcPr>
-          <w:p/>
+          <w:p>
+            <w:r>
+              <w:rPr>
+                <w:rFonts w:ascii="Consolas" w:hAnsi="Consolas"/>
+                <w:b w:val="0"/>
+                <w:sz w:val="18"/>
+              </w:rPr>
+              <w:t>{"max_depth": null, "max_features": 0.5, "min_samples_leaf": 10, "n_estimators": 300}</w:t>
+            </w:r>
+          </w:p>
         </w:tc>
       </w:tr>
       <w:tr>
@@ -2994,7 +3069,7 @@
                 <w:b w:val="0"/>
                 <w:sz w:val="18"/>
               </w:rPr>
-              <w:t>not yet run</w:t>
+              <w:t>55</w:t>
             </w:r>
           </w:p>
         </w:tc>
@@ -3002,19 +3077,44 @@
           <w:tcPr>
             <w:tcW w:type="dxa" w:w="1728"/>
           </w:tcPr>
-          <w:p/>
+          <w:p>
+            <w:r>
+              <w:rPr>
+                <w:b w:val="0"/>
+                <w:sz w:val="18"/>
+              </w:rPr>
+              <w:t>0.4170</w:t>
+            </w:r>
+          </w:p>
         </w:tc>
         <w:tc>
           <w:tcPr>
             <w:tcW w:type="dxa" w:w="1728"/>
           </w:tcPr>
-          <w:p/>
+          <w:p>
+            <w:r>
+              <w:rPr>
+                <w:b w:val="0"/>
+                <w:sz w:val="18"/>
+              </w:rPr>
+              <w:t>0.4454</w:t>
+            </w:r>
+          </w:p>
         </w:tc>
         <w:tc>
           <w:tcPr>
             <w:tcW w:type="dxa" w:w="1728"/>
           </w:tcPr>
-          <w:p/>
+          <w:p>
+            <w:r>
+              <w:rPr>
+                <w:rFonts w:ascii="Consolas" w:hAnsi="Consolas"/>
+                <w:b w:val="0"/>
+                <w:sz w:val="18"/>
+              </w:rPr>
+              <w:t>{"learning_rate": 0.1, "min_child_samples": 10, "num_leaves": 8, "reg_lambda": 0.0}</w:t>
+            </w:r>
+          </w:p>
         </w:tc>
       </w:tr>
       <w:tr>
@@ -3042,7 +3142,7 @@
                 <w:b w:val="0"/>
                 <w:sz w:val="18"/>
               </w:rPr>
-              <w:t>not yet run</w:t>
+              <w:t>97</w:t>
             </w:r>
           </w:p>
         </w:tc>
@@ -3050,26 +3150,51 @@
           <w:tcPr>
             <w:tcW w:type="dxa" w:w="1728"/>
           </w:tcPr>
-          <w:p/>
+          <w:p>
+            <w:r>
+              <w:rPr>
+                <w:b w:val="0"/>
+                <w:sz w:val="18"/>
+              </w:rPr>
+              <w:t>0.4086</w:t>
+            </w:r>
+          </w:p>
         </w:tc>
         <w:tc>
           <w:tcPr>
             <w:tcW w:type="dxa" w:w="1728"/>
           </w:tcPr>
-          <w:p/>
+          <w:p>
+            <w:r>
+              <w:rPr>
+                <w:b w:val="0"/>
+                <w:sz w:val="18"/>
+              </w:rPr>
+              <w:t>0.4443</w:t>
+            </w:r>
+          </w:p>
         </w:tc>
         <w:tc>
           <w:tcPr>
             <w:tcW w:type="dxa" w:w="1728"/>
           </w:tcPr>
-          <w:p/>
+          <w:p>
+            <w:r>
+              <w:rPr>
+                <w:rFonts w:ascii="Consolas" w:hAnsi="Consolas"/>
+                <w:b w:val="0"/>
+                <w:sz w:val="18"/>
+              </w:rPr>
+              <w:t>{"gamma": 1.0, "learning_rate": 0.1, "max_depth": 2, "min_child_weight": 5, "subsample": 0.7}</w:t>
+            </w:r>
+          </w:p>
         </w:tc>
       </w:tr>
     </w:tbl>
     <w:p/>
     <w:p>
       <w:r>
-        <w:t>Tuning moves cross-validation scores by a few thousandths to a hundredth and the test scores do not follow consistently, so the conclusions do not depend on the fixed settings. The one large change, the text Logistic Regression's test PR-AUC from 0.785 to 0.838, comes mostly from refitting the TF-IDF vocabulary on all 437k training reviews (before: a 100k sample) and allowing 100k terms, not from the grid, which moved cross-validation by only 0.002.</w:t>
+        <w:t>At review level tuning moves cross-validation scores by a few thousandths (inside one standard deviation), so the conclusions do not depend on the fixed settings. At game level the searches are larger (55 to 97 settings on 1,191 games) and cross-validation gains of up to 0.08 (Random Forest) did not carry to the test games for Random Forest and LightGBM (test 0.371 and 0.372, lower than before tuning), a sign that the search fitted the validation folds; the models are within each other's intervals either way. The one large change, the text Logistic Regression's test PR-AUC from 0.785 to 0.838, comes mostly from refitting the TF-IDF vocabulary on all 437k training reviews (before: a 100k sample) and allowing 100k terms, not from the grid, which moved cross-validation by only 0.002.</w:t>
       </w:r>
     </w:p>
     <w:p>
@@ -3644,7 +3769,22 @@
                 <w:b w:val="0"/>
                 <w:sz w:val="18"/>
               </w:rPr>
-              <w:t>Data collection and cleaning, documentation, problem statement, shared split and targets, Logistic Regression / Random Forest / LightGBM, model comparison, text models, notebook, tuning of the review and text models, dashboard, board</w:t>
+              <w:t xml:space="preserve">Data collection and cleaning, documentation, problem statement, shared split and targets, Logistic Regression / Random Forest / LightGBM, model comparison, text models, notebook, tuning of every model (review, game and text level, run with the grid search in </w:t>
+            </w:r>
+            <w:r>
+              <w:rPr>
+                <w:rFonts w:ascii="Consolas" w:hAnsi="Consolas"/>
+                <w:b w:val="0"/>
+                <w:sz w:val="18"/>
+              </w:rPr>
+              <w:t>src/models/grid_search.py</w:t>
+            </w:r>
+            <w:r>
+              <w:rPr>
+                <w:b w:val="0"/>
+                <w:sz w:val="18"/>
+              </w:rPr>
+              <w:t>), dashboard, board</w:t>
             </w:r>
           </w:p>
         </w:tc>
@@ -3734,7 +3874,7 @@
                 <w:b w:val="0"/>
                 <w:sz w:val="18"/>
               </w:rPr>
-              <w:t>Exploratory analysis (29 figures, association tests, tag combinations); game-level tuning (in progress)</w:t>
+              <w:t>Exploratory analysis (29 figures, association tests, tag combinations); dashboard wireframe and CSV downloads</w:t>
             </w:r>
           </w:p>
         </w:tc>

</xml_diff>

<commit_message>
Dashboard deployed at indieguard.streamlit.app: README, report, slides, docs
</commit_message>
<xml_diff>
--- a/docs/final_report.docx
+++ b/docs/final_report.docx
@@ -3449,6 +3449,31 @@
     </w:p>
     <w:p>
       <w:r>
+        <w:t xml:space="preserve">The dashboard is deployed at https://indieguard.streamlit.app (five pages; run locally with </w:t>
+      </w:r>
+      <w:r>
+        <w:rPr>
+          <w:rFonts w:ascii="Consolas" w:hAnsi="Consolas"/>
+          <w:sz w:val="19"/>
+        </w:rPr>
+        <w:t>streamlit run src/dashboard/app.py</w:t>
+      </w:r>
+      <w:r>
+        <w:t xml:space="preserve">, see </w:t>
+      </w:r>
+      <w:r>
+        <w:rPr>
+          <w:rFonts w:ascii="Consolas" w:hAnsi="Consolas"/>
+          <w:sz w:val="19"/>
+        </w:rPr>
+        <w:t>docs/dashboard.md</w:t>
+      </w:r>
+      <w:r>
+        <w:t>).</w:t>
+      </w:r>
+    </w:p>
+    <w:p>
+      <w:r>
         <w:t xml:space="preserve">An exported XGBoost model scores a game's review-reception tier from launch-time features only (83 features: price, launch timing, content, platforms and the 68 tag components). </w:t>
       </w:r>
       <w:r>

</xml_diff>